<commit_message>
Render '*' section breaks as visible '* * *' in 1.2 export
Preprocessor now converts standalone '*' lines in the source to
'\* \* \*' (escaped) before pandoc, producing a visible '* * *'
paragraph in Body Text style at each scene break.

Ch. 10 now has the section break visible at P11 between the night
terror and the prayer-watching meditation; same treatment applied
across all 17 chapters that use section breaks.

Caveat: the asterisks are left-aligned (Body Text default), not
centered. Centering would require either raw HTML in the source or
a pandoc lua filter.

Co-Authored-By: Claude Opus 4.7 (1M context) <noreply@anthropic.com>
</commit_message>
<xml_diff>
--- a/valley-of-shadows/editions/1.2/chapter-10.docx
+++ b/valley-of-shadows/editions/1.2/chapter-10.docx
@@ -85,7 +85,15 @@
     </w:p>
     <w:p>
       <w:pPr>
-        <w:pStyle w:val="FirstParagraph"/>
+        <w:pStyle w:val="BodyText"/>
+      </w:pPr>
+      <w:r>
+        <w:t xml:space="preserve">* * *</w:t>
+      </w:r>
+    </w:p>
+    <w:p>
+      <w:pPr>
+        <w:pStyle w:val="BodyText"/>
       </w:pPr>
       <w:r>
         <w:t xml:space="preserve">In the days that follow, I have begun to watch Elijah pray.</w:t>
@@ -1556,109 +1564,6 @@
       <w:pPr>
         <w:ind w:left="6480" w:hanging="360"/>
       </w:pPr>
-    </w:lvl>
-  </w:abstractNum>
-  <w:abstractNum w:abstractNumId="991">
-    <w:nsid w:val="0000A991"/>
-    <w:multiLevelType w:val="multilevel"/>
-    <w:lvl w:ilvl="0">
-      <w:numFmt w:val="bullet"/>
-      <w:lvlText w:val=""/>
-      <w:lvlJc w:val="left"/>
-      <w:pPr>
-        <w:ind w:left="720" w:hanging="360"/>
-      </w:pPr>
-      <w:rPr>
-        <w:rFonts w:ascii="Symbol" w:hAnsi="Symbol" w:cs="Symbol" w:hint="default"/>
-      </w:rPr>
-    </w:lvl>
-    <w:lvl w:ilvl="1">
-      <w:numFmt w:val="bullet"/>
-      <w:lvlText w:val="o"/>
-      <w:lvlJc w:val="left"/>
-      <w:pPr>
-        <w:ind w:left="1440" w:hanging="360"/>
-      </w:pPr>
-      <w:rPr>
-        <w:rFonts w:ascii="Courier New" w:hAnsi="Courier New" w:cs="Courier New" w:hint="default"/>
-      </w:rPr>
-    </w:lvl>
-    <w:lvl w:ilvl="2">
-      <w:numFmt w:val="bullet"/>
-      <w:lvlText w:val=""/>
-      <w:lvlJc w:val="left"/>
-      <w:pPr>
-        <w:ind w:left="2160" w:hanging="360"/>
-      </w:pPr>
-      <w:rPr>
-        <w:rFonts w:ascii="Wingdings" w:hAnsi="Wingdings" w:cs="Wingdings" w:hint="default"/>
-      </w:rPr>
-    </w:lvl>
-    <w:lvl w:ilvl="3">
-      <w:numFmt w:val="bullet"/>
-      <w:lvlText w:val=""/>
-      <w:lvlJc w:val="left"/>
-      <w:pPr>
-        <w:ind w:left="2880" w:hanging="360"/>
-      </w:pPr>
-      <w:rPr>
-        <w:rFonts w:ascii="Symbol" w:hAnsi="Symbol" w:cs="Symbol" w:hint="default"/>
-      </w:rPr>
-    </w:lvl>
-    <w:lvl w:ilvl="4">
-      <w:numFmt w:val="bullet"/>
-      <w:lvlText w:val="o"/>
-      <w:lvlJc w:val="left"/>
-      <w:pPr>
-        <w:ind w:left="3600" w:hanging="360"/>
-      </w:pPr>
-      <w:rPr>
-        <w:rFonts w:ascii="Courier New" w:hAnsi="Courier New" w:cs="Courier New" w:hint="default"/>
-      </w:rPr>
-    </w:lvl>
-    <w:lvl w:ilvl="5">
-      <w:numFmt w:val="bullet"/>
-      <w:lvlText w:val=""/>
-      <w:lvlJc w:val="left"/>
-      <w:pPr>
-        <w:ind w:left="4320" w:hanging="360"/>
-      </w:pPr>
-      <w:rPr>
-        <w:rFonts w:ascii="Wingdings" w:hAnsi="Wingdings" w:cs="Wingdings" w:hint="default"/>
-      </w:rPr>
-    </w:lvl>
-    <w:lvl w:ilvl="6">
-      <w:numFmt w:val="bullet"/>
-      <w:lvlText w:val=""/>
-      <w:lvlJc w:val="left"/>
-      <w:pPr>
-        <w:ind w:left="5040" w:hanging="360"/>
-      </w:pPr>
-      <w:rPr>
-        <w:rFonts w:ascii="Symbol" w:hAnsi="Symbol" w:cs="Symbol" w:hint="default"/>
-      </w:rPr>
-    </w:lvl>
-    <w:lvl w:ilvl="7">
-      <w:numFmt w:val="bullet"/>
-      <w:lvlText w:val="o"/>
-      <w:lvlJc w:val="left"/>
-      <w:pPr>
-        <w:ind w:left="5760" w:hanging="360"/>
-      </w:pPr>
-      <w:rPr>
-        <w:rFonts w:ascii="Courier New" w:hAnsi="Courier New" w:cs="Courier New" w:hint="default"/>
-      </w:rPr>
-    </w:lvl>
-    <w:lvl w:ilvl="8">
-      <w:numFmt w:val="bullet"/>
-      <w:lvlText w:val=""/>
-      <w:lvlJc w:val="left"/>
-      <w:pPr>
-        <w:ind w:left="6480" w:hanging="360"/>
-      </w:pPr>
-      <w:rPr>
-        <w:rFonts w:ascii="Wingdings" w:hAnsi="Wingdings" w:cs="Wingdings" w:hint="default"/>
-      </w:rPr>
     </w:lvl>
   </w:abstractNum>
   <w:num w16cid:durableId="1061756927" w:numId="1">
@@ -1690,9 +1595,6 @@
   </w:num>
   <w:num w:numId="1000">
     <w:abstractNumId w:val="990"/>
-  </w:num>
-  <w:num w:numId="1001">
-    <w:abstractNumId w:val="991"/>
   </w:num>
 </w:numbering>
 </file>

</xml_diff>